<commit_message>
Lucien and Vaibhav bios
</commit_message>
<xml_diff>
--- a/authors/charles-nicholson-bio.docx
+++ b/authors/charles-nicholson-bio.docx
@@ -14,7 +14,35 @@
         <w:rPr>
           <w:rFonts w:ascii="Calibri" w:hAnsi="Calibri" w:cs="Calibri"/>
         </w:rPr>
-        <w:t>Charles Nicholson is an economist working at the intersection of competition and climate economics. After nearly a decade advising on regulatory and competition issues, he shifted his focus to the economics of decarbonisation, motivated by the belief that effective climate policy demands the same analytical rigour as competition policy.</w:t>
+        <w:t xml:space="preserve">Charles Nicholson is an economist working at the intersection of competition and climate economics. After nearly a decade advising on regulatory and competition issues, he shifted his focus to the economics of </w:t>
+      </w:r>
+      <w:proofErr w:type="spellStart"/>
+      <w:r>
+        <w:rPr>
+          <w:rFonts w:ascii="Calibri" w:hAnsi="Calibri" w:cs="Calibri"/>
+        </w:rPr>
+        <w:t>decarbonisation</w:t>
+      </w:r>
+      <w:proofErr w:type="spellEnd"/>
+      <w:r>
+        <w:rPr>
+          <w:rFonts w:ascii="Calibri" w:hAnsi="Calibri" w:cs="Calibri"/>
+        </w:rPr>
+        <w:t xml:space="preserve">, motivated by the belief that effective climate policy demands the same analytical </w:t>
+      </w:r>
+      <w:proofErr w:type="spellStart"/>
+      <w:r>
+        <w:rPr>
+          <w:rFonts w:ascii="Calibri" w:hAnsi="Calibri" w:cs="Calibri"/>
+        </w:rPr>
+        <w:t>rigour</w:t>
+      </w:r>
+      <w:proofErr w:type="spellEnd"/>
+      <w:r>
+        <w:rPr>
+          <w:rFonts w:ascii="Calibri" w:hAnsi="Calibri" w:cs="Calibri"/>
+        </w:rPr>
+        <w:t xml:space="preserve"> as competition policy.</w:t>
       </w:r>
     </w:p>
     <w:p>
@@ -29,35 +57,33 @@
         <w:rPr>
           <w:rFonts w:ascii="Calibri" w:hAnsi="Calibri" w:cs="Calibri"/>
         </w:rPr>
-        <w:t xml:space="preserve">He holds a Master’s in the Economics of Energy, Climate Change and Sustainability at the Barcelona School of Economics, a </w:t>
-      </w:r>
-      <w:proofErr w:type="gramStart"/>
-      <w:r>
-        <w:rPr>
-          <w:rFonts w:ascii="Calibri" w:hAnsi="Calibri" w:cs="Calibri"/>
-        </w:rPr>
-        <w:t>Master’s in Economics</w:t>
-      </w:r>
-      <w:proofErr w:type="gramEnd"/>
-      <w:r>
-        <w:rPr>
-          <w:rFonts w:ascii="Calibri" w:hAnsi="Calibri" w:cs="Calibri"/>
-        </w:rPr>
-        <w:t xml:space="preserve"> from University College London, and a </w:t>
-      </w:r>
-      <w:proofErr w:type="gramStart"/>
-      <w:r>
-        <w:rPr>
-          <w:rFonts w:ascii="Calibri" w:hAnsi="Calibri" w:cs="Calibri"/>
-        </w:rPr>
-        <w:t>Bachelor in Economics</w:t>
-      </w:r>
-      <w:proofErr w:type="gramEnd"/>
-      <w:r>
-        <w:rPr>
-          <w:rFonts w:ascii="Calibri" w:hAnsi="Calibri" w:cs="Calibri"/>
-        </w:rPr>
-        <w:t xml:space="preserve"> from the University of East Anglia.  His research explores how electricity markets and investment incentives interact with climate objectives, including recent modelling of endogenous investment in renewables and storage, and the welfare impacts of cross-country electricity interconnectors.</w:t>
+        <w:t>He holds a Master’s in the Economics of Energy, Climate Change and Sustainability at the Barcelona School of Economics, a Master’s in Economics from University College London, and a Bachelor in Economics from the University of East Anglia</w:t>
+      </w:r>
+      <w:r>
+        <w:rPr>
+          <w:rFonts w:ascii="Calibri" w:hAnsi="Calibri" w:cs="Calibri"/>
+        </w:rPr>
+        <w:t xml:space="preserve"> (First Class </w:t>
+      </w:r>
+      <w:proofErr w:type="spellStart"/>
+      <w:r>
+        <w:rPr>
+          <w:rFonts w:ascii="Calibri" w:hAnsi="Calibri" w:cs="Calibri"/>
+        </w:rPr>
+        <w:t>Honours</w:t>
+      </w:r>
+      <w:proofErr w:type="spellEnd"/>
+      <w:r>
+        <w:rPr>
+          <w:rFonts w:ascii="Calibri" w:hAnsi="Calibri" w:cs="Calibri"/>
+        </w:rPr>
+        <w:t>)</w:t>
+      </w:r>
+      <w:r>
+        <w:rPr>
+          <w:rFonts w:ascii="Calibri" w:hAnsi="Calibri" w:cs="Calibri"/>
+        </w:rPr>
+        <w:t>.  His research explores how electricity markets and investment incentives interact with climate objectives, including recent modelling of endogenous investment in renewables and storage, and the welfare impacts of cross-country electricity interconnectors.</w:t>
       </w:r>
     </w:p>
     <w:p>
@@ -72,7 +98,35 @@
         <w:rPr>
           <w:rFonts w:ascii="Calibri" w:hAnsi="Calibri" w:cs="Calibri"/>
         </w:rPr>
-        <w:t>Before moving into climate economics, Charles worked for a leading competition economics consultancy, specialising in empirical methods for merger and abuse of dominance cases. This background shapes his approach to climate policy: markets can be powerful tools for decarbonisation — if they are competitive, well designed, and well governed.</w:t>
+        <w:t xml:space="preserve">Before moving into climate economics, Charles worked for a leading competition economics consultancy, </w:t>
+      </w:r>
+      <w:proofErr w:type="spellStart"/>
+      <w:r>
+        <w:rPr>
+          <w:rFonts w:ascii="Calibri" w:hAnsi="Calibri" w:cs="Calibri"/>
+        </w:rPr>
+        <w:t>specialising</w:t>
+      </w:r>
+      <w:proofErr w:type="spellEnd"/>
+      <w:r>
+        <w:rPr>
+          <w:rFonts w:ascii="Calibri" w:hAnsi="Calibri" w:cs="Calibri"/>
+        </w:rPr>
+        <w:t xml:space="preserve"> in empirical methods for merger and abuse of dominance cases. This background shapes his approach to climate policy: markets can be powerful tools for </w:t>
+      </w:r>
+      <w:proofErr w:type="spellStart"/>
+      <w:r>
+        <w:rPr>
+          <w:rFonts w:ascii="Calibri" w:hAnsi="Calibri" w:cs="Calibri"/>
+        </w:rPr>
+        <w:t>decarbonisation</w:t>
+      </w:r>
+      <w:proofErr w:type="spellEnd"/>
+      <w:r>
+        <w:rPr>
+          <w:rFonts w:ascii="Calibri" w:hAnsi="Calibri" w:cs="Calibri"/>
+        </w:rPr>
+        <w:t xml:space="preserve"> — if they are competitive, well designed, and well governed.</w:t>
       </w:r>
     </w:p>
     <w:p>

</xml_diff>

<commit_message>
Update to Charlie's bio
</commit_message>
<xml_diff>
--- a/authors/charles-nicholson-bio.docx
+++ b/authors/charles-nicholson-bio.docx
@@ -14,7 +14,43 @@
         <w:rPr>
           <w:rFonts w:ascii="Calibri" w:hAnsi="Calibri" w:cs="Calibri"/>
         </w:rPr>
-        <w:t xml:space="preserve">Charles Nicholson is an economist working at the intersection of competition and climate economics. After nearly a decade advising on regulatory and competition issues, he shifted his focus to the economics of </w:t>
+        <w:t>Charles Nicholson is a</w:t>
+      </w:r>
+      <w:r>
+        <w:rPr>
+          <w:rFonts w:ascii="Calibri" w:hAnsi="Calibri" w:cs="Calibri"/>
+        </w:rPr>
+        <w:t xml:space="preserve"> climate and energy</w:t>
+      </w:r>
+      <w:r>
+        <w:rPr>
+          <w:rFonts w:ascii="Calibri" w:hAnsi="Calibri" w:cs="Calibri"/>
+        </w:rPr>
+        <w:t xml:space="preserve"> economist </w:t>
+      </w:r>
+      <w:r>
+        <w:rPr>
+          <w:rFonts w:ascii="Calibri" w:hAnsi="Calibri" w:cs="Calibri"/>
+        </w:rPr>
+        <w:t>with nearly a decade’s experience as an economic consultant</w:t>
+      </w:r>
+      <w:r>
+        <w:rPr>
+          <w:rFonts w:ascii="Calibri" w:hAnsi="Calibri" w:cs="Calibri"/>
+        </w:rPr>
+        <w:t xml:space="preserve">. </w:t>
+      </w:r>
+      <w:r>
+        <w:rPr>
+          <w:rFonts w:ascii="Calibri" w:hAnsi="Calibri" w:cs="Calibri"/>
+        </w:rPr>
+        <w:t>H</w:t>
+      </w:r>
+      <w:r>
+        <w:rPr>
+          <w:rFonts w:ascii="Calibri" w:hAnsi="Calibri" w:cs="Calibri"/>
+        </w:rPr>
+        <w:t xml:space="preserve">e shifted his focus to the economics of </w:t>
       </w:r>
       <w:proofErr w:type="spellStart"/>
       <w:r>
@@ -28,7 +64,19 @@
         <w:rPr>
           <w:rFonts w:ascii="Calibri" w:hAnsi="Calibri" w:cs="Calibri"/>
         </w:rPr>
-        <w:t xml:space="preserve">, motivated by the belief that effective climate policy demands the same analytical </w:t>
+        <w:t>, motivated by the belief that effective climate</w:t>
+      </w:r>
+      <w:r>
+        <w:rPr>
+          <w:rFonts w:ascii="Calibri" w:hAnsi="Calibri" w:cs="Calibri"/>
+        </w:rPr>
+        <w:t xml:space="preserve"> and energy</w:t>
+      </w:r>
+      <w:r>
+        <w:rPr>
+          <w:rFonts w:ascii="Calibri" w:hAnsi="Calibri" w:cs="Calibri"/>
+        </w:rPr>
+        <w:t xml:space="preserve"> policy demands the same analytical </w:t>
       </w:r>
       <w:proofErr w:type="spellStart"/>
       <w:r>
@@ -83,7 +131,27 @@
         <w:rPr>
           <w:rFonts w:ascii="Calibri" w:hAnsi="Calibri" w:cs="Calibri"/>
         </w:rPr>
-        <w:t>.  His research explores how electricity markets and investment incentives interact with climate objectives, including recent modelling of endogenous investment in renewables and storage, and the welfare impacts of cross-country electricity interconnectors.</w:t>
+        <w:t xml:space="preserve">.  His research explores </w:t>
+      </w:r>
+      <w:r>
+        <w:rPr>
+          <w:rFonts w:ascii="Calibri" w:hAnsi="Calibri" w:cs="Calibri"/>
+        </w:rPr>
+        <w:t xml:space="preserve">the welfare impacts of cross-country electricity interconnectors and battery storage in </w:t>
+      </w:r>
+      <w:proofErr w:type="spellStart"/>
+      <w:r>
+        <w:rPr>
+          <w:rFonts w:ascii="Calibri" w:hAnsi="Calibri" w:cs="Calibri"/>
+        </w:rPr>
+        <w:t>decarbonising</w:t>
+      </w:r>
+      <w:proofErr w:type="spellEnd"/>
+      <w:r>
+        <w:rPr>
+          <w:rFonts w:ascii="Calibri" w:hAnsi="Calibri" w:cs="Calibri"/>
+        </w:rPr>
+        <w:t xml:space="preserve"> electricity markets.</w:t>
       </w:r>
     </w:p>
     <w:p>
@@ -98,7 +166,31 @@
         <w:rPr>
           <w:rFonts w:ascii="Calibri" w:hAnsi="Calibri" w:cs="Calibri"/>
         </w:rPr>
-        <w:t xml:space="preserve">Before moving into climate economics, Charles worked for a leading competition economics consultancy, </w:t>
+        <w:t xml:space="preserve">Before moving into climate </w:t>
+      </w:r>
+      <w:r>
+        <w:rPr>
+          <w:rFonts w:ascii="Calibri" w:hAnsi="Calibri" w:cs="Calibri"/>
+        </w:rPr>
+        <w:t xml:space="preserve">and energy </w:t>
+      </w:r>
+      <w:r>
+        <w:rPr>
+          <w:rFonts w:ascii="Calibri" w:hAnsi="Calibri" w:cs="Calibri"/>
+        </w:rPr>
+        <w:t>economics, Charles worked for a leading competition economics consultancy</w:t>
+      </w:r>
+      <w:r>
+        <w:rPr>
+          <w:rFonts w:ascii="Calibri" w:hAnsi="Calibri" w:cs="Calibri"/>
+        </w:rPr>
+        <w:t xml:space="preserve"> and the Australian Competition and Consumer Commission</w:t>
+      </w:r>
+      <w:r>
+        <w:rPr>
+          <w:rFonts w:ascii="Calibri" w:hAnsi="Calibri" w:cs="Calibri"/>
+        </w:rPr>
+        <w:t xml:space="preserve">, </w:t>
       </w:r>
       <w:proofErr w:type="spellStart"/>
       <w:r>
@@ -112,7 +204,7 @@
         <w:rPr>
           <w:rFonts w:ascii="Calibri" w:hAnsi="Calibri" w:cs="Calibri"/>
         </w:rPr>
-        <w:t xml:space="preserve"> in empirical methods for merger and abuse of dominance cases. This background shapes his approach to climate policy: markets can be powerful tools for </w:t>
+        <w:t xml:space="preserve"> in merger and abuse of dominance cases. This background shapes his approach to climate policy: markets can be powerful tools for </w:t>
       </w:r>
       <w:proofErr w:type="spellStart"/>
       <w:r>
@@ -155,7 +247,43 @@
         <w:rPr>
           <w:rFonts w:ascii="Calibri" w:hAnsi="Calibri" w:cs="Calibri"/>
         </w:rPr>
-        <w:t>, Charles writes about the analytical foundations of climate policy: how models, incentives, and institutions shape the transition to net zero, and how quantitative tools can support smarter, fairer climate action.</w:t>
+        <w:t>, Charles writes about the analytical foundations of climate</w:t>
+      </w:r>
+      <w:r>
+        <w:rPr>
+          <w:rFonts w:ascii="Calibri" w:hAnsi="Calibri" w:cs="Calibri"/>
+        </w:rPr>
+        <w:t xml:space="preserve"> and energy</w:t>
+      </w:r>
+      <w:r>
+        <w:rPr>
+          <w:rFonts w:ascii="Calibri" w:hAnsi="Calibri" w:cs="Calibri"/>
+        </w:rPr>
+        <w:t xml:space="preserve"> policy: how models, incentives, and </w:t>
+      </w:r>
+      <w:r>
+        <w:rPr>
+          <w:rFonts w:ascii="Calibri" w:hAnsi="Calibri" w:cs="Calibri"/>
+        </w:rPr>
+        <w:t>policies</w:t>
+      </w:r>
+      <w:r>
+        <w:rPr>
+          <w:rFonts w:ascii="Calibri" w:hAnsi="Calibri" w:cs="Calibri"/>
+        </w:rPr>
+        <w:t xml:space="preserve"> shape the transition to net zero, and how quantitative tools can support smarter</w:t>
+      </w:r>
+      <w:r>
+        <w:rPr>
+          <w:rFonts w:ascii="Calibri" w:hAnsi="Calibri" w:cs="Calibri"/>
+        </w:rPr>
+        <w:t xml:space="preserve"> and </w:t>
+      </w:r>
+      <w:r>
+        <w:rPr>
+          <w:rFonts w:ascii="Calibri" w:hAnsi="Calibri" w:cs="Calibri"/>
+        </w:rPr>
+        <w:t>fairer action.</w:t>
       </w:r>
     </w:p>
     <w:p/>

</xml_diff>